<commit_message>
ajánlások kezdetleges működő állapot #1 (0x01) (első számú)[0]
</commit_message>
<xml_diff>
--- a/documentation/database/2027_13.4_vizsgaremek_Adatbázismodell-diagramm.docx
+++ b/documentation/database/2027_13.4_vizsgaremek_Adatbázismodell-diagramm.docx
@@ -15,8 +15,13 @@
         <w:pStyle w:val="Cmsor2"/>
       </w:pPr>
       <w:r>
-        <w:t>1.1. profil</w:t>
-      </w:r>
+        <w:t xml:space="preserve">1.1. </w:t>
+      </w:r>
+      <w:proofErr w:type="spellStart"/>
+      <w:r>
+        <w:t>fiok</w:t>
+      </w:r>
+      <w:proofErr w:type="spellEnd"/>
     </w:p>
     <w:p>
       <w:pPr>
@@ -50,7 +55,25 @@
           <w:szCs w:val="24"/>
           <w:lang w:eastAsia="hu-HU"/>
         </w:rPr>
-        <w:t xml:space="preserve"> [INTEGER, elsődleges kulcs, NOT NULL]: Profil azonosító</w:t>
+        <w:t xml:space="preserve"> [INTEGER, elsődleges kulcs, NOT NULL]: </w:t>
+      </w:r>
+      <w:r>
+        <w:rPr>
+          <w:rFonts w:ascii="Segoe UI" w:eastAsia="Times New Roman" w:hAnsi="Segoe UI" w:cs="Segoe UI"/>
+          <w:sz w:val="24"/>
+          <w:szCs w:val="24"/>
+          <w:lang w:eastAsia="hu-HU"/>
+        </w:rPr>
+        <w:t xml:space="preserve">Fiók </w:t>
+      </w:r>
+      <w:r>
+        <w:rPr>
+          <w:rFonts w:ascii="Segoe UI" w:eastAsia="Times New Roman" w:hAnsi="Segoe UI" w:cs="Segoe UI"/>
+          <w:sz w:val="24"/>
+          <w:szCs w:val="24"/>
+          <w:lang w:eastAsia="hu-HU"/>
+        </w:rPr>
+        <w:t>azonosító</w:t>
       </w:r>
     </w:p>
     <w:p>
@@ -149,7 +172,7 @@
           <w:szCs w:val="24"/>
           <w:lang w:eastAsia="hu-HU"/>
         </w:rPr>
-        <w:t xml:space="preserve">255), NOT NULL]: Jelszó vagy </w:t>
+        <w:t xml:space="preserve">255), NOT NULL]: </w:t>
       </w:r>
       <w:proofErr w:type="spellStart"/>
       <w:r>
@@ -159,7 +182,16 @@
           <w:szCs w:val="24"/>
           <w:lang w:eastAsia="hu-HU"/>
         </w:rPr>
-        <w:t>jelszóhash</w:t>
+        <w:t>J</w:t>
+      </w:r>
+      <w:r>
+        <w:rPr>
+          <w:rFonts w:ascii="Segoe UI" w:eastAsia="Times New Roman" w:hAnsi="Segoe UI" w:cs="Segoe UI"/>
+          <w:sz w:val="24"/>
+          <w:szCs w:val="24"/>
+          <w:lang w:eastAsia="hu-HU"/>
+        </w:rPr>
+        <w:t>elszóhash</w:t>
       </w:r>
       <w:proofErr w:type="spellEnd"/>
     </w:p>
@@ -215,7 +247,87 @@
           <w:szCs w:val="24"/>
           <w:lang w:eastAsia="hu-HU"/>
         </w:rPr>
-        <w:t>0) WITHOUT TIME ZONE, NOT NULL]: A profil létrehozásának időpontja</w:t>
+        <w:t xml:space="preserve">0) WITHOUT TIME ZONE, NOT NULL]: A </w:t>
+      </w:r>
+      <w:r>
+        <w:rPr>
+          <w:rFonts w:ascii="Segoe UI" w:eastAsia="Times New Roman" w:hAnsi="Segoe UI" w:cs="Segoe UI"/>
+          <w:sz w:val="24"/>
+          <w:szCs w:val="24"/>
+          <w:lang w:eastAsia="hu-HU"/>
+        </w:rPr>
+        <w:t xml:space="preserve">fiók </w:t>
+      </w:r>
+      <w:r>
+        <w:rPr>
+          <w:rFonts w:ascii="Segoe UI" w:eastAsia="Times New Roman" w:hAnsi="Segoe UI" w:cs="Segoe UI"/>
+          <w:sz w:val="24"/>
+          <w:szCs w:val="24"/>
+          <w:lang w:eastAsia="hu-HU"/>
+        </w:rPr>
+        <w:t>létrehozásának időpontja</w:t>
+      </w:r>
+    </w:p>
+    <w:p>
+      <w:pPr>
+        <w:numPr>
+          <w:ilvl w:val="0"/>
+          <w:numId w:val="1"/>
+        </w:numPr>
+        <w:spacing w:before="100" w:beforeAutospacing="1" w:after="100" w:afterAutospacing="1" w:line="240" w:lineRule="auto"/>
+        <w:rPr>
+          <w:rFonts w:ascii="Segoe UI" w:eastAsia="Times New Roman" w:hAnsi="Segoe UI" w:cs="Segoe UI"/>
+          <w:sz w:val="24"/>
+          <w:szCs w:val="24"/>
+          <w:lang w:eastAsia="hu-HU"/>
+        </w:rPr>
+      </w:pPr>
+      <w:r>
+        <w:rPr>
+          <w:rFonts w:ascii="Segoe UI" w:eastAsia="Times New Roman" w:hAnsi="Segoe UI" w:cs="Segoe UI"/>
+          <w:sz w:val="24"/>
+          <w:szCs w:val="24"/>
+          <w:lang w:eastAsia="hu-HU"/>
+        </w:rPr>
+        <w:t>preferencia</w:t>
+      </w:r>
+      <w:r>
+        <w:rPr>
+          <w:rFonts w:ascii="Segoe UI" w:eastAsia="Times New Roman" w:hAnsi="Segoe UI" w:cs="Segoe UI"/>
+          <w:sz w:val="24"/>
+          <w:szCs w:val="24"/>
+          <w:lang w:eastAsia="hu-HU"/>
+        </w:rPr>
+        <w:t xml:space="preserve"> [</w:t>
+      </w:r>
+      <w:proofErr w:type="gramStart"/>
+      <w:r>
+        <w:rPr>
+          <w:rFonts w:ascii="Segoe UI" w:eastAsia="Times New Roman" w:hAnsi="Segoe UI" w:cs="Segoe UI"/>
+          <w:sz w:val="24"/>
+          <w:szCs w:val="24"/>
+          <w:lang w:eastAsia="hu-HU"/>
+        </w:rPr>
+        <w:t>VARCHAR(</w:t>
+      </w:r>
+      <w:proofErr w:type="gramEnd"/>
+      <w:r>
+        <w:rPr>
+          <w:rFonts w:ascii="Segoe UI" w:eastAsia="Times New Roman" w:hAnsi="Segoe UI" w:cs="Segoe UI"/>
+          <w:sz w:val="24"/>
+          <w:szCs w:val="24"/>
+          <w:lang w:eastAsia="hu-HU"/>
+        </w:rPr>
+        <w:t xml:space="preserve">255), NOT NULL]: A fiókhoz </w:t>
+      </w:r>
+      <w:r>
+        <w:rPr>
+          <w:rFonts w:ascii="Segoe UI" w:eastAsia="Times New Roman" w:hAnsi="Segoe UI" w:cs="Segoe UI"/>
+          <w:sz w:val="24"/>
+          <w:szCs w:val="24"/>
+          <w:lang w:eastAsia="hu-HU"/>
+        </w:rPr>
+        <w:t>preferált étel kategóriája</w:t>
       </w:r>
     </w:p>
     <w:p>
@@ -979,144 +1091,6 @@
       </w:pPr>
       <w:r>
         <w:lastRenderedPageBreak/>
-        <w:t xml:space="preserve">1.6. </w:t>
-      </w:r>
-      <w:proofErr w:type="spellStart"/>
-      <w:r>
-        <w:t>fiok</w:t>
-      </w:r>
-      <w:proofErr w:type="spellEnd"/>
-    </w:p>
-    <w:p>
-      <w:pPr>
-        <w:numPr>
-          <w:ilvl w:val="0"/>
-          <w:numId w:val="6"/>
-        </w:numPr>
-        <w:spacing w:before="100" w:beforeAutospacing="1" w:after="100" w:afterAutospacing="1" w:line="240" w:lineRule="auto"/>
-        <w:rPr>
-          <w:rFonts w:ascii="Segoe UI" w:eastAsia="Times New Roman" w:hAnsi="Segoe UI" w:cs="Segoe UI"/>
-          <w:sz w:val="24"/>
-          <w:szCs w:val="24"/>
-          <w:lang w:eastAsia="hu-HU"/>
-        </w:rPr>
-      </w:pPr>
-      <w:proofErr w:type="spellStart"/>
-      <w:r>
-        <w:rPr>
-          <w:rFonts w:ascii="Segoe UI" w:eastAsia="Times New Roman" w:hAnsi="Segoe UI" w:cs="Segoe UI"/>
-          <w:sz w:val="24"/>
-          <w:szCs w:val="24"/>
-          <w:lang w:eastAsia="hu-HU"/>
-        </w:rPr>
-        <w:t>id</w:t>
-      </w:r>
-      <w:proofErr w:type="spellEnd"/>
-      <w:r>
-        <w:rPr>
-          <w:rFonts w:ascii="Segoe UI" w:eastAsia="Times New Roman" w:hAnsi="Segoe UI" w:cs="Segoe UI"/>
-          <w:sz w:val="24"/>
-          <w:szCs w:val="24"/>
-          <w:lang w:eastAsia="hu-HU"/>
-        </w:rPr>
-        <w:t xml:space="preserve"> [INTEGER, elsődleges kulcs, NOT NULL]: Fiók azonosító</w:t>
-      </w:r>
-    </w:p>
-    <w:p>
-      <w:pPr>
-        <w:numPr>
-          <w:ilvl w:val="0"/>
-          <w:numId w:val="6"/>
-        </w:numPr>
-        <w:spacing w:before="100" w:beforeAutospacing="1" w:after="100" w:afterAutospacing="1" w:line="240" w:lineRule="auto"/>
-        <w:rPr>
-          <w:rFonts w:ascii="Segoe UI" w:eastAsia="Times New Roman" w:hAnsi="Segoe UI" w:cs="Segoe UI"/>
-          <w:sz w:val="24"/>
-          <w:szCs w:val="24"/>
-          <w:lang w:eastAsia="hu-HU"/>
-        </w:rPr>
-      </w:pPr>
-      <w:proofErr w:type="spellStart"/>
-      <w:r>
-        <w:rPr>
-          <w:rFonts w:ascii="Segoe UI" w:eastAsia="Times New Roman" w:hAnsi="Segoe UI" w:cs="Segoe UI"/>
-          <w:sz w:val="24"/>
-          <w:szCs w:val="24"/>
-          <w:lang w:eastAsia="hu-HU"/>
-        </w:rPr>
-        <w:t>etrend</w:t>
-      </w:r>
-      <w:proofErr w:type="spellEnd"/>
-      <w:r>
-        <w:rPr>
-          <w:rFonts w:ascii="Segoe UI" w:eastAsia="Times New Roman" w:hAnsi="Segoe UI" w:cs="Segoe UI"/>
-          <w:sz w:val="24"/>
-          <w:szCs w:val="24"/>
-          <w:lang w:eastAsia="hu-HU"/>
-        </w:rPr>
-        <w:t xml:space="preserve"> [</w:t>
-      </w:r>
-      <w:proofErr w:type="gramStart"/>
-      <w:r>
-        <w:rPr>
-          <w:rFonts w:ascii="Segoe UI" w:eastAsia="Times New Roman" w:hAnsi="Segoe UI" w:cs="Segoe UI"/>
-          <w:sz w:val="24"/>
-          <w:szCs w:val="24"/>
-          <w:lang w:eastAsia="hu-HU"/>
-        </w:rPr>
-        <w:t>VARCHAR(</w:t>
-      </w:r>
-      <w:proofErr w:type="gramEnd"/>
-      <w:r>
-        <w:rPr>
-          <w:rFonts w:ascii="Segoe UI" w:eastAsia="Times New Roman" w:hAnsi="Segoe UI" w:cs="Segoe UI"/>
-          <w:sz w:val="24"/>
-          <w:szCs w:val="24"/>
-          <w:lang w:eastAsia="hu-HU"/>
-        </w:rPr>
-        <w:t>255), NOT NULL]: A fiókhoz tartozó étrend</w:t>
-      </w:r>
-    </w:p>
-    <w:p>
-      <w:pPr>
-        <w:numPr>
-          <w:ilvl w:val="0"/>
-          <w:numId w:val="6"/>
-        </w:numPr>
-        <w:spacing w:before="100" w:beforeAutospacing="1" w:after="100" w:afterAutospacing="1" w:line="240" w:lineRule="auto"/>
-        <w:rPr>
-          <w:rFonts w:ascii="Segoe UI" w:eastAsia="Times New Roman" w:hAnsi="Segoe UI" w:cs="Segoe UI"/>
-          <w:sz w:val="24"/>
-          <w:szCs w:val="24"/>
-          <w:lang w:eastAsia="hu-HU"/>
-        </w:rPr>
-      </w:pPr>
-      <w:proofErr w:type="spellStart"/>
-      <w:r>
-        <w:rPr>
-          <w:rFonts w:ascii="Segoe UI" w:eastAsia="Times New Roman" w:hAnsi="Segoe UI" w:cs="Segoe UI"/>
-          <w:sz w:val="24"/>
-          <w:szCs w:val="24"/>
-          <w:lang w:eastAsia="hu-HU"/>
-        </w:rPr>
-        <w:t>profil_id</w:t>
-      </w:r>
-      <w:proofErr w:type="spellEnd"/>
-      <w:r>
-        <w:rPr>
-          <w:rFonts w:ascii="Segoe UI" w:eastAsia="Times New Roman" w:hAnsi="Segoe UI" w:cs="Segoe UI"/>
-          <w:sz w:val="24"/>
-          <w:szCs w:val="24"/>
-          <w:lang w:eastAsia="hu-HU"/>
-        </w:rPr>
-        <w:t xml:space="preserve"> [INTEGER, idegen kulcs, NOT NULL]: A fiókhoz tartozó profil azonosítója</w:t>
-      </w:r>
-    </w:p>
-    <w:p>
-      <w:pPr>
-        <w:pStyle w:val="Cmsor2"/>
-      </w:pPr>
-      <w:r>
         <w:t xml:space="preserve">1.7. </w:t>
       </w:r>
       <w:proofErr w:type="spellStart"/>
@@ -1660,7 +1634,6 @@
           <w:szCs w:val="24"/>
           <w:lang w:eastAsia="hu-HU"/>
         </w:rPr>
-        <w:lastRenderedPageBreak/>
         <w:t>velemeny</w:t>
       </w:r>
       <w:proofErr w:type="spellEnd"/>
@@ -1799,6 +1772,7 @@
           <w:szCs w:val="24"/>
           <w:lang w:eastAsia="hu-HU"/>
         </w:rPr>
+        <w:lastRenderedPageBreak/>
         <w:t>velemeny</w:t>
       </w:r>
       <w:proofErr w:type="spellEnd"/>
@@ -1960,7 +1934,16 @@
           <w:szCs w:val="24"/>
           <w:lang w:eastAsia="hu-HU"/>
         </w:rPr>
-        <w:t xml:space="preserve">profil.id → </w:t>
+        <w:t>fiok</w:t>
+      </w:r>
+      <w:r>
+        <w:rPr>
+          <w:rFonts w:ascii="Segoe UI" w:eastAsia="Times New Roman" w:hAnsi="Segoe UI" w:cs="Segoe UI"/>
+          <w:sz w:val="24"/>
+          <w:szCs w:val="24"/>
+          <w:lang w:eastAsia="hu-HU"/>
+        </w:rPr>
+        <w:t xml:space="preserve">.id → </w:t>
       </w:r>
       <w:proofErr w:type="spellStart"/>
       <w:proofErr w:type="gramStart"/>
@@ -1971,7 +1954,7 @@
           <w:szCs w:val="24"/>
           <w:lang w:eastAsia="hu-HU"/>
         </w:rPr>
-        <w:t>fiok.profil</w:t>
+        <w:t>huto.profil</w:t>
       </w:r>
       <w:proofErr w:type="gramEnd"/>
       <w:r>
@@ -2035,9 +2018,18 @@
           <w:szCs w:val="24"/>
           <w:lang w:eastAsia="hu-HU"/>
         </w:rPr>
-        <w:t xml:space="preserve">profil.id → </w:t>
+        <w:t xml:space="preserve">fiok.id → </w:t>
       </w:r>
       <w:proofErr w:type="spellStart"/>
+      <w:r>
+        <w:rPr>
+          <w:rFonts w:ascii="Segoe UI" w:eastAsia="Times New Roman" w:hAnsi="Segoe UI" w:cs="Segoe UI"/>
+          <w:sz w:val="24"/>
+          <w:szCs w:val="24"/>
+          <w:lang w:eastAsia="hu-HU"/>
+        </w:rPr>
+        <w:t>allergen_fiok_</w:t>
+      </w:r>
       <w:proofErr w:type="gramStart"/>
       <w:r>
         <w:rPr>
@@ -2046,7 +2038,175 @@
           <w:szCs w:val="24"/>
           <w:lang w:eastAsia="hu-HU"/>
         </w:rPr>
-        <w:t>huto.profil</w:t>
+        <w:t>osszekoto.fiok</w:t>
+      </w:r>
+      <w:proofErr w:type="gramEnd"/>
+      <w:r>
+        <w:rPr>
+          <w:rFonts w:ascii="Segoe UI" w:eastAsia="Times New Roman" w:hAnsi="Segoe UI" w:cs="Segoe UI"/>
+          <w:sz w:val="24"/>
+          <w:szCs w:val="24"/>
+          <w:lang w:eastAsia="hu-HU"/>
+        </w:rPr>
+        <w:t>_id</w:t>
+      </w:r>
+      <w:proofErr w:type="spellEnd"/>
+      <w:r>
+        <w:rPr>
+          <w:rFonts w:ascii="Segoe UI" w:eastAsia="Times New Roman" w:hAnsi="Segoe UI" w:cs="Segoe UI"/>
+          <w:sz w:val="24"/>
+          <w:szCs w:val="24"/>
+          <w:lang w:eastAsia="hu-HU"/>
+        </w:rPr>
+        <w:t xml:space="preserve"> [</w:t>
+      </w:r>
+      <w:proofErr w:type="gramStart"/>
+      <w:r>
+        <w:rPr>
+          <w:rFonts w:ascii="Segoe UI" w:eastAsia="Times New Roman" w:hAnsi="Segoe UI" w:cs="Segoe UI"/>
+          <w:sz w:val="24"/>
+          <w:szCs w:val="24"/>
+          <w:lang w:eastAsia="hu-HU"/>
+        </w:rPr>
+        <w:t>1:N</w:t>
+      </w:r>
+      <w:proofErr w:type="gramEnd"/>
+      <w:r>
+        <w:rPr>
+          <w:rFonts w:ascii="Segoe UI" w:eastAsia="Times New Roman" w:hAnsi="Segoe UI" w:cs="Segoe UI"/>
+          <w:sz w:val="24"/>
+          <w:szCs w:val="24"/>
+          <w:lang w:eastAsia="hu-HU"/>
+        </w:rPr>
+        <w:t xml:space="preserve"> kapcsolat]</w:t>
+      </w:r>
+    </w:p>
+    <w:p>
+      <w:pPr>
+        <w:numPr>
+          <w:ilvl w:val="0"/>
+          <w:numId w:val="14"/>
+        </w:numPr>
+        <w:spacing w:before="100" w:beforeAutospacing="1" w:after="100" w:afterAutospacing="1" w:line="240" w:lineRule="auto"/>
+        <w:rPr>
+          <w:rFonts w:ascii="Segoe UI" w:eastAsia="Times New Roman" w:hAnsi="Segoe UI" w:cs="Segoe UI"/>
+          <w:sz w:val="24"/>
+          <w:szCs w:val="24"/>
+          <w:lang w:eastAsia="hu-HU"/>
+        </w:rPr>
+      </w:pPr>
+      <w:r>
+        <w:rPr>
+          <w:rFonts w:ascii="Segoe UI" w:eastAsia="Times New Roman" w:hAnsi="Segoe UI" w:cs="Segoe UI"/>
+          <w:sz w:val="24"/>
+          <w:szCs w:val="24"/>
+          <w:lang w:eastAsia="hu-HU"/>
+        </w:rPr>
+        <w:t xml:space="preserve">fiok.id → </w:t>
+      </w:r>
+      <w:proofErr w:type="spellStart"/>
+      <w:r>
+        <w:rPr>
+          <w:rFonts w:ascii="Segoe UI" w:eastAsia="Times New Roman" w:hAnsi="Segoe UI" w:cs="Segoe UI"/>
+          <w:sz w:val="24"/>
+          <w:szCs w:val="24"/>
+          <w:lang w:eastAsia="hu-HU"/>
+        </w:rPr>
+        <w:t>velemeny_</w:t>
+      </w:r>
+      <w:proofErr w:type="gramStart"/>
+      <w:r>
+        <w:rPr>
+          <w:rFonts w:ascii="Segoe UI" w:eastAsia="Times New Roman" w:hAnsi="Segoe UI" w:cs="Segoe UI"/>
+          <w:sz w:val="24"/>
+          <w:szCs w:val="24"/>
+          <w:lang w:eastAsia="hu-HU"/>
+        </w:rPr>
+        <w:t>receptrol.fiok</w:t>
+      </w:r>
+      <w:proofErr w:type="gramEnd"/>
+      <w:r>
+        <w:rPr>
+          <w:rFonts w:ascii="Segoe UI" w:eastAsia="Times New Roman" w:hAnsi="Segoe UI" w:cs="Segoe UI"/>
+          <w:sz w:val="24"/>
+          <w:szCs w:val="24"/>
+          <w:lang w:eastAsia="hu-HU"/>
+        </w:rPr>
+        <w:t>_id</w:t>
+      </w:r>
+      <w:proofErr w:type="spellEnd"/>
+      <w:r>
+        <w:rPr>
+          <w:rFonts w:ascii="Segoe UI" w:eastAsia="Times New Roman" w:hAnsi="Segoe UI" w:cs="Segoe UI"/>
+          <w:sz w:val="24"/>
+          <w:szCs w:val="24"/>
+          <w:lang w:eastAsia="hu-HU"/>
+        </w:rPr>
+        <w:t xml:space="preserve"> [</w:t>
+      </w:r>
+      <w:proofErr w:type="gramStart"/>
+      <w:r>
+        <w:rPr>
+          <w:rFonts w:ascii="Segoe UI" w:eastAsia="Times New Roman" w:hAnsi="Segoe UI" w:cs="Segoe UI"/>
+          <w:sz w:val="24"/>
+          <w:szCs w:val="24"/>
+          <w:lang w:eastAsia="hu-HU"/>
+        </w:rPr>
+        <w:t>1:N</w:t>
+      </w:r>
+      <w:proofErr w:type="gramEnd"/>
+      <w:r>
+        <w:rPr>
+          <w:rFonts w:ascii="Segoe UI" w:eastAsia="Times New Roman" w:hAnsi="Segoe UI" w:cs="Segoe UI"/>
+          <w:sz w:val="24"/>
+          <w:szCs w:val="24"/>
+          <w:lang w:eastAsia="hu-HU"/>
+        </w:rPr>
+        <w:t xml:space="preserve"> kapcsolat]</w:t>
+      </w:r>
+    </w:p>
+    <w:p>
+      <w:pPr>
+        <w:numPr>
+          <w:ilvl w:val="0"/>
+          <w:numId w:val="14"/>
+        </w:numPr>
+        <w:spacing w:before="100" w:beforeAutospacing="1" w:after="100" w:afterAutospacing="1" w:line="240" w:lineRule="auto"/>
+        <w:rPr>
+          <w:rFonts w:ascii="Segoe UI" w:eastAsia="Times New Roman" w:hAnsi="Segoe UI" w:cs="Segoe UI"/>
+          <w:sz w:val="24"/>
+          <w:szCs w:val="24"/>
+          <w:lang w:eastAsia="hu-HU"/>
+        </w:rPr>
+      </w:pPr>
+      <w:r>
+        <w:rPr>
+          <w:rFonts w:ascii="Segoe UI" w:eastAsia="Times New Roman" w:hAnsi="Segoe UI" w:cs="Segoe UI"/>
+          <w:sz w:val="24"/>
+          <w:szCs w:val="24"/>
+          <w:lang w:eastAsia="hu-HU"/>
+        </w:rPr>
+        <w:t xml:space="preserve">fiok.id → </w:t>
+      </w:r>
+      <w:proofErr w:type="spellStart"/>
+      <w:r>
+        <w:rPr>
+          <w:rFonts w:ascii="Segoe UI" w:eastAsia="Times New Roman" w:hAnsi="Segoe UI" w:cs="Segoe UI"/>
+          <w:sz w:val="24"/>
+          <w:szCs w:val="24"/>
+          <w:lang w:eastAsia="hu-HU"/>
+        </w:rPr>
+        <w:t>velemeny_</w:t>
+      </w:r>
+      <w:proofErr w:type="gramStart"/>
+      <w:r>
+        <w:rPr>
+          <w:rFonts w:ascii="Segoe UI" w:eastAsia="Times New Roman" w:hAnsi="Segoe UI" w:cs="Segoe UI"/>
+          <w:sz w:val="24"/>
+          <w:szCs w:val="24"/>
+          <w:lang w:eastAsia="hu-HU"/>
+        </w:rPr>
+        <w:t>alapanyagrol.fiok</w:t>
       </w:r>
       <w:proofErr w:type="gramEnd"/>
       <w:r>
@@ -2644,7 +2804,6 @@
           <w:szCs w:val="24"/>
           <w:lang w:eastAsia="hu-HU"/>
         </w:rPr>
-        <w:lastRenderedPageBreak/>
         <w:t xml:space="preserve">allergenek.id → </w:t>
       </w:r>
       <w:proofErr w:type="spellStart"/>
@@ -2764,6 +2923,7 @@
           <w:szCs w:val="24"/>
           <w:lang w:eastAsia="hu-HU"/>
         </w:rPr>
+        <w:lastRenderedPageBreak/>
         <w:t>Kapcsolatok:</w:t>
       </w:r>
     </w:p>
@@ -3075,11 +3235,17 @@
         <w:pStyle w:val="Cmsor2"/>
       </w:pPr>
       <w:r>
-        <w:t xml:space="preserve">3.6. </w:t>
+        <w:t>3.</w:t>
+      </w:r>
+      <w:r>
+        <w:t>6</w:t>
+      </w:r>
+      <w:r>
+        <w:t xml:space="preserve">. </w:t>
       </w:r>
       <w:proofErr w:type="spellStart"/>
       <w:r>
-        <w:t>fiok</w:t>
+        <w:t>mertekegysegek</w:t>
       </w:r>
       <w:proofErr w:type="spellEnd"/>
     </w:p>
@@ -3136,10 +3302,6 @@
     </w:p>
     <w:p>
       <w:pPr>
-        <w:numPr>
-          <w:ilvl w:val="0"/>
-          <w:numId w:val="18"/>
-        </w:numPr>
         <w:spacing w:before="100" w:beforeAutospacing="1" w:after="100" w:afterAutospacing="1" w:line="240" w:lineRule="auto"/>
         <w:rPr>
           <w:rFonts w:ascii="Segoe UI" w:eastAsia="Times New Roman" w:hAnsi="Segoe UI" w:cs="Segoe UI"/>
@@ -3155,268 +3317,7 @@
           <w:szCs w:val="24"/>
           <w:lang w:eastAsia="hu-HU"/>
         </w:rPr>
-        <w:t xml:space="preserve">fiok.id → </w:t>
-      </w:r>
-      <w:proofErr w:type="spellStart"/>
-      <w:r>
-        <w:rPr>
-          <w:rFonts w:ascii="Segoe UI" w:eastAsia="Times New Roman" w:hAnsi="Segoe UI" w:cs="Segoe UI"/>
-          <w:sz w:val="24"/>
-          <w:szCs w:val="24"/>
-          <w:lang w:eastAsia="hu-HU"/>
-        </w:rPr>
-        <w:t>allergen_fiok_</w:t>
-      </w:r>
-      <w:proofErr w:type="gramStart"/>
-      <w:r>
-        <w:rPr>
-          <w:rFonts w:ascii="Segoe UI" w:eastAsia="Times New Roman" w:hAnsi="Segoe UI" w:cs="Segoe UI"/>
-          <w:sz w:val="24"/>
-          <w:szCs w:val="24"/>
-          <w:lang w:eastAsia="hu-HU"/>
-        </w:rPr>
-        <w:t>osszekoto.fiok</w:t>
-      </w:r>
-      <w:proofErr w:type="gramEnd"/>
-      <w:r>
-        <w:rPr>
-          <w:rFonts w:ascii="Segoe UI" w:eastAsia="Times New Roman" w:hAnsi="Segoe UI" w:cs="Segoe UI"/>
-          <w:sz w:val="24"/>
-          <w:szCs w:val="24"/>
-          <w:lang w:eastAsia="hu-HU"/>
-        </w:rPr>
-        <w:t>_id</w:t>
-      </w:r>
-      <w:proofErr w:type="spellEnd"/>
-      <w:r>
-        <w:rPr>
-          <w:rFonts w:ascii="Segoe UI" w:eastAsia="Times New Roman" w:hAnsi="Segoe UI" w:cs="Segoe UI"/>
-          <w:sz w:val="24"/>
-          <w:szCs w:val="24"/>
-          <w:lang w:eastAsia="hu-HU"/>
-        </w:rPr>
-        <w:t xml:space="preserve"> [</w:t>
-      </w:r>
-      <w:proofErr w:type="gramStart"/>
-      <w:r>
-        <w:rPr>
-          <w:rFonts w:ascii="Segoe UI" w:eastAsia="Times New Roman" w:hAnsi="Segoe UI" w:cs="Segoe UI"/>
-          <w:sz w:val="24"/>
-          <w:szCs w:val="24"/>
-          <w:lang w:eastAsia="hu-HU"/>
-        </w:rPr>
-        <w:t>1:N</w:t>
-      </w:r>
-      <w:proofErr w:type="gramEnd"/>
-      <w:r>
-        <w:rPr>
-          <w:rFonts w:ascii="Segoe UI" w:eastAsia="Times New Roman" w:hAnsi="Segoe UI" w:cs="Segoe UI"/>
-          <w:sz w:val="24"/>
-          <w:szCs w:val="24"/>
-          <w:lang w:eastAsia="hu-HU"/>
-        </w:rPr>
-        <w:t xml:space="preserve"> kapcsolat]</w:t>
-      </w:r>
-    </w:p>
-    <w:p>
-      <w:pPr>
-        <w:numPr>
-          <w:ilvl w:val="0"/>
-          <w:numId w:val="18"/>
-        </w:numPr>
-        <w:spacing w:before="100" w:beforeAutospacing="1" w:after="100" w:afterAutospacing="1" w:line="240" w:lineRule="auto"/>
-        <w:rPr>
-          <w:rFonts w:ascii="Segoe UI" w:eastAsia="Times New Roman" w:hAnsi="Segoe UI" w:cs="Segoe UI"/>
-          <w:sz w:val="24"/>
-          <w:szCs w:val="24"/>
-          <w:lang w:eastAsia="hu-HU"/>
-        </w:rPr>
-      </w:pPr>
-      <w:r>
-        <w:rPr>
-          <w:rFonts w:ascii="Segoe UI" w:eastAsia="Times New Roman" w:hAnsi="Segoe UI" w:cs="Segoe UI"/>
-          <w:sz w:val="24"/>
-          <w:szCs w:val="24"/>
-          <w:lang w:eastAsia="hu-HU"/>
-        </w:rPr>
-        <w:t xml:space="preserve">fiok.id → </w:t>
-      </w:r>
-      <w:proofErr w:type="spellStart"/>
-      <w:r>
-        <w:rPr>
-          <w:rFonts w:ascii="Segoe UI" w:eastAsia="Times New Roman" w:hAnsi="Segoe UI" w:cs="Segoe UI"/>
-          <w:sz w:val="24"/>
-          <w:szCs w:val="24"/>
-          <w:lang w:eastAsia="hu-HU"/>
-        </w:rPr>
-        <w:t>velemeny_</w:t>
-      </w:r>
-      <w:proofErr w:type="gramStart"/>
-      <w:r>
-        <w:rPr>
-          <w:rFonts w:ascii="Segoe UI" w:eastAsia="Times New Roman" w:hAnsi="Segoe UI" w:cs="Segoe UI"/>
-          <w:sz w:val="24"/>
-          <w:szCs w:val="24"/>
-          <w:lang w:eastAsia="hu-HU"/>
-        </w:rPr>
-        <w:t>receptrol.fiok</w:t>
-      </w:r>
-      <w:proofErr w:type="gramEnd"/>
-      <w:r>
-        <w:rPr>
-          <w:rFonts w:ascii="Segoe UI" w:eastAsia="Times New Roman" w:hAnsi="Segoe UI" w:cs="Segoe UI"/>
-          <w:sz w:val="24"/>
-          <w:szCs w:val="24"/>
-          <w:lang w:eastAsia="hu-HU"/>
-        </w:rPr>
-        <w:t>_id</w:t>
-      </w:r>
-      <w:proofErr w:type="spellEnd"/>
-      <w:r>
-        <w:rPr>
-          <w:rFonts w:ascii="Segoe UI" w:eastAsia="Times New Roman" w:hAnsi="Segoe UI" w:cs="Segoe UI"/>
-          <w:sz w:val="24"/>
-          <w:szCs w:val="24"/>
-          <w:lang w:eastAsia="hu-HU"/>
-        </w:rPr>
-        <w:t xml:space="preserve"> [</w:t>
-      </w:r>
-      <w:proofErr w:type="gramStart"/>
-      <w:r>
-        <w:rPr>
-          <w:rFonts w:ascii="Segoe UI" w:eastAsia="Times New Roman" w:hAnsi="Segoe UI" w:cs="Segoe UI"/>
-          <w:sz w:val="24"/>
-          <w:szCs w:val="24"/>
-          <w:lang w:eastAsia="hu-HU"/>
-        </w:rPr>
-        <w:t>1:N</w:t>
-      </w:r>
-      <w:proofErr w:type="gramEnd"/>
-      <w:r>
-        <w:rPr>
-          <w:rFonts w:ascii="Segoe UI" w:eastAsia="Times New Roman" w:hAnsi="Segoe UI" w:cs="Segoe UI"/>
-          <w:sz w:val="24"/>
-          <w:szCs w:val="24"/>
-          <w:lang w:eastAsia="hu-HU"/>
-        </w:rPr>
-        <w:t xml:space="preserve"> kapcsolat]</w:t>
-      </w:r>
-    </w:p>
-    <w:p>
-      <w:pPr>
-        <w:numPr>
-          <w:ilvl w:val="0"/>
-          <w:numId w:val="18"/>
-        </w:numPr>
-        <w:spacing w:before="100" w:beforeAutospacing="1" w:after="100" w:afterAutospacing="1" w:line="240" w:lineRule="auto"/>
-        <w:rPr>
-          <w:rFonts w:ascii="Segoe UI" w:eastAsia="Times New Roman" w:hAnsi="Segoe UI" w:cs="Segoe UI"/>
-          <w:sz w:val="24"/>
-          <w:szCs w:val="24"/>
-          <w:lang w:eastAsia="hu-HU"/>
-        </w:rPr>
-      </w:pPr>
-      <w:r>
-        <w:rPr>
-          <w:rFonts w:ascii="Segoe UI" w:eastAsia="Times New Roman" w:hAnsi="Segoe UI" w:cs="Segoe UI"/>
-          <w:sz w:val="24"/>
-          <w:szCs w:val="24"/>
-          <w:lang w:eastAsia="hu-HU"/>
-        </w:rPr>
-        <w:t xml:space="preserve">fiok.id → </w:t>
-      </w:r>
-      <w:proofErr w:type="spellStart"/>
-      <w:r>
-        <w:rPr>
-          <w:rFonts w:ascii="Segoe UI" w:eastAsia="Times New Roman" w:hAnsi="Segoe UI" w:cs="Segoe UI"/>
-          <w:sz w:val="24"/>
-          <w:szCs w:val="24"/>
-          <w:lang w:eastAsia="hu-HU"/>
-        </w:rPr>
-        <w:t>velemeny_</w:t>
-      </w:r>
-      <w:proofErr w:type="gramStart"/>
-      <w:r>
-        <w:rPr>
-          <w:rFonts w:ascii="Segoe UI" w:eastAsia="Times New Roman" w:hAnsi="Segoe UI" w:cs="Segoe UI"/>
-          <w:sz w:val="24"/>
-          <w:szCs w:val="24"/>
-          <w:lang w:eastAsia="hu-HU"/>
-        </w:rPr>
-        <w:t>alapanyagrol.fiok</w:t>
-      </w:r>
-      <w:proofErr w:type="gramEnd"/>
-      <w:r>
-        <w:rPr>
-          <w:rFonts w:ascii="Segoe UI" w:eastAsia="Times New Roman" w:hAnsi="Segoe UI" w:cs="Segoe UI"/>
-          <w:sz w:val="24"/>
-          <w:szCs w:val="24"/>
-          <w:lang w:eastAsia="hu-HU"/>
-        </w:rPr>
-        <w:t>_id</w:t>
-      </w:r>
-      <w:proofErr w:type="spellEnd"/>
-      <w:r>
-        <w:rPr>
-          <w:rFonts w:ascii="Segoe UI" w:eastAsia="Times New Roman" w:hAnsi="Segoe UI" w:cs="Segoe UI"/>
-          <w:sz w:val="24"/>
-          <w:szCs w:val="24"/>
-          <w:lang w:eastAsia="hu-HU"/>
-        </w:rPr>
-        <w:t xml:space="preserve"> [</w:t>
-      </w:r>
-      <w:proofErr w:type="gramStart"/>
-      <w:r>
-        <w:rPr>
-          <w:rFonts w:ascii="Segoe UI" w:eastAsia="Times New Roman" w:hAnsi="Segoe UI" w:cs="Segoe UI"/>
-          <w:sz w:val="24"/>
-          <w:szCs w:val="24"/>
-          <w:lang w:eastAsia="hu-HU"/>
-        </w:rPr>
-        <w:t>1:N</w:t>
-      </w:r>
-      <w:proofErr w:type="gramEnd"/>
-      <w:r>
-        <w:rPr>
-          <w:rFonts w:ascii="Segoe UI" w:eastAsia="Times New Roman" w:hAnsi="Segoe UI" w:cs="Segoe UI"/>
-          <w:sz w:val="24"/>
-          <w:szCs w:val="24"/>
-          <w:lang w:eastAsia="hu-HU"/>
-        </w:rPr>
-        <w:t xml:space="preserve"> kapcsolat]</w:t>
-      </w:r>
-    </w:p>
-    <w:p>
-      <w:pPr>
-        <w:pStyle w:val="Cmsor2"/>
-      </w:pPr>
-      <w:r>
-        <w:t xml:space="preserve">3.7. </w:t>
-      </w:r>
-      <w:proofErr w:type="spellStart"/>
-      <w:r>
-        <w:t>mertekegysegek</w:t>
-      </w:r>
-      <w:proofErr w:type="spellEnd"/>
-    </w:p>
-    <w:p>
-      <w:pPr>
-        <w:spacing w:before="100" w:beforeAutospacing="1" w:after="100" w:afterAutospacing="1" w:line="240" w:lineRule="auto"/>
-        <w:rPr>
-          <w:rFonts w:ascii="Segoe UI" w:eastAsia="Times New Roman" w:hAnsi="Segoe UI" w:cs="Segoe UI"/>
-          <w:sz w:val="24"/>
-          <w:szCs w:val="24"/>
-          <w:lang w:eastAsia="hu-HU"/>
-        </w:rPr>
-      </w:pPr>
-      <w:r>
-        <w:rPr>
-          <w:rFonts w:ascii="Segoe UI" w:eastAsia="Times New Roman" w:hAnsi="Segoe UI" w:cs="Segoe UI"/>
-          <w:sz w:val="24"/>
-          <w:szCs w:val="24"/>
-          <w:lang w:eastAsia="hu-HU"/>
-        </w:rPr>
-        <w:t xml:space="preserve">Elsődleges kulcs: </w:t>
+        <w:t xml:space="preserve">- Az SQL-fájl nem tartalmaz deklarált idegen kulcsot a </w:t>
       </w:r>
       <w:proofErr w:type="spellStart"/>
       <w:r>
@@ -3426,60 +3327,9 @@
           <w:szCs w:val="20"/>
           <w:lang w:eastAsia="hu-HU"/>
         </w:rPr>
-        <w:t>id</w:t>
+        <w:t>mertekegysegek</w:t>
       </w:r>
       <w:proofErr w:type="spellEnd"/>
-    </w:p>
-    <w:p>
-      <w:pPr>
-        <w:spacing w:before="100" w:beforeAutospacing="1" w:after="100" w:afterAutospacing="1" w:line="240" w:lineRule="auto"/>
-        <w:rPr>
-          <w:rFonts w:ascii="Segoe UI" w:eastAsia="Times New Roman" w:hAnsi="Segoe UI" w:cs="Segoe UI"/>
-          <w:sz w:val="24"/>
-          <w:szCs w:val="24"/>
-          <w:lang w:eastAsia="hu-HU"/>
-        </w:rPr>
-      </w:pPr>
-      <w:r>
-        <w:rPr>
-          <w:rFonts w:ascii="Segoe UI" w:eastAsia="Times New Roman" w:hAnsi="Segoe UI" w:cs="Segoe UI"/>
-          <w:sz w:val="24"/>
-          <w:szCs w:val="24"/>
-          <w:lang w:eastAsia="hu-HU"/>
-        </w:rPr>
-        <w:t>Kapcsolatok:</w:t>
-      </w:r>
-    </w:p>
-    <w:p>
-      <w:pPr>
-        <w:spacing w:before="100" w:beforeAutospacing="1" w:after="100" w:afterAutospacing="1" w:line="240" w:lineRule="auto"/>
-        <w:rPr>
-          <w:rFonts w:ascii="Segoe UI" w:eastAsia="Times New Roman" w:hAnsi="Segoe UI" w:cs="Segoe UI"/>
-          <w:sz w:val="24"/>
-          <w:szCs w:val="24"/>
-          <w:lang w:eastAsia="hu-HU"/>
-        </w:rPr>
-      </w:pPr>
-      <w:r>
-        <w:rPr>
-          <w:rFonts w:ascii="Segoe UI" w:eastAsia="Times New Roman" w:hAnsi="Segoe UI" w:cs="Segoe UI"/>
-          <w:sz w:val="24"/>
-          <w:szCs w:val="24"/>
-          <w:lang w:eastAsia="hu-HU"/>
-        </w:rPr>
-        <w:t xml:space="preserve">- Az SQL-fájl nem tartalmaz deklarált idegen kulcsot a </w:t>
-      </w:r>
-      <w:proofErr w:type="spellStart"/>
-      <w:r>
-        <w:rPr>
-          <w:rFonts w:ascii="Segoe UI" w:eastAsia="Times New Roman" w:hAnsi="Segoe UI" w:cs="Segoe UI"/>
-          <w:sz w:val="20"/>
-          <w:szCs w:val="20"/>
-          <w:lang w:eastAsia="hu-HU"/>
-        </w:rPr>
-        <w:t>mertekegysegek</w:t>
-      </w:r>
-      <w:proofErr w:type="spellEnd"/>
       <w:r>
         <w:rPr>
           <w:rFonts w:ascii="Segoe UI" w:eastAsia="Times New Roman" w:hAnsi="Segoe UI" w:cs="Segoe UI"/>
@@ -3495,7 +3345,13 @@
         <w:pStyle w:val="Cmsor2"/>
       </w:pPr>
       <w:r>
-        <w:t xml:space="preserve">3.8. </w:t>
+        <w:t>3.</w:t>
+      </w:r>
+      <w:r>
+        <w:t>7</w:t>
+      </w:r>
+      <w:r>
+        <w:t xml:space="preserve">. </w:t>
       </w:r>
       <w:proofErr w:type="spellStart"/>
       <w:r>
@@ -3638,8 +3494,13 @@
         <w:pStyle w:val="Cmsor2"/>
       </w:pPr>
       <w:r>
-        <w:lastRenderedPageBreak/>
-        <w:t xml:space="preserve">3.9. </w:t>
+        <w:t>3.</w:t>
+      </w:r>
+      <w:r>
+        <w:t>8</w:t>
+      </w:r>
+      <w:r>
+        <w:t xml:space="preserve">. </w:t>
       </w:r>
       <w:proofErr w:type="spellStart"/>
       <w:r>
@@ -3782,7 +3643,13 @@
         <w:pStyle w:val="Cmsor2"/>
       </w:pPr>
       <w:r>
-        <w:t xml:space="preserve">3.10. </w:t>
+        <w:t>3.</w:t>
+      </w:r>
+      <w:r>
+        <w:t>9</w:t>
+      </w:r>
+      <w:r>
+        <w:t xml:space="preserve">. </w:t>
       </w:r>
       <w:proofErr w:type="spellStart"/>
       <w:r>
@@ -3899,7 +3766,25 @@
           <w:szCs w:val="24"/>
           <w:lang w:eastAsia="hu-HU"/>
         </w:rPr>
-        <w:t xml:space="preserve"> → profil.id [N:1 kapcsolat]</w:t>
+        <w:t xml:space="preserve"> → </w:t>
+      </w:r>
+      <w:r>
+        <w:rPr>
+          <w:rFonts w:ascii="Segoe UI" w:eastAsia="Times New Roman" w:hAnsi="Segoe UI" w:cs="Segoe UI"/>
+          <w:sz w:val="24"/>
+          <w:szCs w:val="24"/>
+          <w:lang w:eastAsia="hu-HU"/>
+        </w:rPr>
+        <w:t>fiok</w:t>
+      </w:r>
+      <w:r>
+        <w:rPr>
+          <w:rFonts w:ascii="Segoe UI" w:eastAsia="Times New Roman" w:hAnsi="Segoe UI" w:cs="Segoe UI"/>
+          <w:sz w:val="24"/>
+          <w:szCs w:val="24"/>
+          <w:lang w:eastAsia="hu-HU"/>
+        </w:rPr>
+        <w:t>.id [N:1 kapcsolat]</w:t>
       </w:r>
     </w:p>
     <w:p>
@@ -3932,6 +3817,7 @@
           <w:szCs w:val="24"/>
           <w:lang w:eastAsia="hu-HU"/>
         </w:rPr>
+        <w:lastRenderedPageBreak/>
         <w:t>Kapcsolatok:</w:t>
       </w:r>
     </w:p>
@@ -4340,54 +4226,25 @@
     </w:p>
     <w:p>
       <w:pPr>
-        <w:rPr>
-          <w:rFonts w:ascii="Segoe UI" w:hAnsi="Segoe UI" w:cs="Segoe UI"/>
-        </w:rPr>
-      </w:pPr>
-    </w:p>
-    <w:p>
-      <w:pPr>
-        <w:rPr>
-          <w:rFonts w:ascii="Segoe UI" w:hAnsi="Segoe UI" w:cs="Segoe UI"/>
-        </w:rPr>
-      </w:pPr>
-    </w:p>
-    <w:p>
-      <w:pPr>
-        <w:rPr>
-          <w:rFonts w:ascii="Segoe UI" w:hAnsi="Segoe UI" w:cs="Segoe UI"/>
-        </w:rPr>
-      </w:pPr>
-    </w:p>
-    <w:p>
-      <w:pPr>
-        <w:rPr>
-          <w:rFonts w:ascii="Segoe UI" w:hAnsi="Segoe UI" w:cs="Segoe UI"/>
-        </w:rPr>
-      </w:pPr>
-    </w:p>
-    <w:p>
-      <w:pPr>
         <w:pStyle w:val="Cmsor1"/>
       </w:pPr>
       <w:r>
         <w:rPr>
           <w:noProof/>
         </w:rPr>
-        <w:lastRenderedPageBreak/>
         <w:drawing>
-          <wp:anchor distT="0" distB="0" distL="114300" distR="114300" simplePos="0" relativeHeight="251658240" behindDoc="1" locked="0" layoutInCell="1" allowOverlap="1" wp14:anchorId="69D6BF7F" wp14:editId="09BC83EE">
+          <wp:anchor distT="0" distB="0" distL="114300" distR="114300" simplePos="0" relativeHeight="251658240" behindDoc="1" locked="0" layoutInCell="1" allowOverlap="1" wp14:anchorId="149210F4" wp14:editId="12158526">
             <wp:simplePos x="0" y="0"/>
             <wp:positionH relativeFrom="margin">
               <wp:align>center</wp:align>
             </wp:positionH>
             <wp:positionV relativeFrom="paragraph">
-              <wp:posOffset>522384</wp:posOffset>
+              <wp:posOffset>574313</wp:posOffset>
             </wp:positionV>
-            <wp:extent cx="6798688" cy="3536487"/>
-            <wp:effectExtent l="0" t="0" r="2540" b="6985"/>
+            <wp:extent cx="6400800" cy="4174773"/>
+            <wp:effectExtent l="0" t="0" r="0" b="0"/>
             <wp:wrapNone/>
-            <wp:docPr id="695038835" name="Kép 2"/>
+            <wp:docPr id="1316515204" name="Kép 2"/>
             <wp:cNvGraphicFramePr>
               <a:graphicFrameLocks xmlns:a="http://schemas.openxmlformats.org/drawingml/2006/main" noChangeAspect="1"/>
             </wp:cNvGraphicFramePr>
@@ -4395,7 +4252,7 @@
               <a:graphicData uri="http://schemas.openxmlformats.org/drawingml/2006/picture">
                 <pic:pic xmlns:pic="http://schemas.openxmlformats.org/drawingml/2006/picture">
                   <pic:nvPicPr>
-                    <pic:cNvPr id="695038835" name="Kép 695038835"/>
+                    <pic:cNvPr id="1316515204" name="Kép 1316515204"/>
                     <pic:cNvPicPr/>
                   </pic:nvPicPr>
                   <pic:blipFill>
@@ -4413,7 +4270,7 @@
                   <pic:spPr>
                     <a:xfrm>
                       <a:off x="0" y="0"/>
-                      <a:ext cx="6798688" cy="3536487"/>
+                      <a:ext cx="6400800" cy="4174773"/>
                     </a:xfrm>
                     <a:prstGeom prst="rect">
                       <a:avLst/>

</xml_diff>